<commit_message>
fix: run web app and validate inputs
</commit_message>
<xml_diff>
--- a/data/template_congvan.docx
+++ b/data/template_congvan.docx
@@ -2,86 +2,17 @@
 <file path=word/document.xml><?xml version="1.0" encoding="utf-8"?>
 <w:document xmlns:wpc="http://schemas.microsoft.com/office/word/2010/wordprocessingCanvas" xmlns:mo="http://schemas.microsoft.com/office/mac/office/2008/main" xmlns:mc="http://schemas.openxmlformats.org/markup-compatibility/2006" xmlns:mv="urn:schemas-microsoft-com:mac:vml" xmlns:o="urn:schemas-microsoft-com:office:office" xmlns:r="http://schemas.openxmlformats.org/officeDocument/2006/relationships" xmlns:m="http://schemas.openxmlformats.org/officeDocument/2006/math" xmlns:v="urn:schemas-microsoft-com:vml" xmlns:wp14="http://schemas.microsoft.com/office/word/2010/wordprocessingDrawing" xmlns:wp="http://schemas.openxmlformats.org/drawingml/2006/wordprocessingDrawing" xmlns:w10="urn:schemas-microsoft-com:office:word" xmlns:w="http://schemas.openxmlformats.org/wordprocessingml/2006/main" xmlns:w14="http://schemas.microsoft.com/office/word/2010/wordml" xmlns:wpg="http://schemas.microsoft.com/office/word/2010/wordprocessingGroup" xmlns:wpi="http://schemas.microsoft.com/office/word/2010/wordprocessingInk" xmlns:wne="http://schemas.microsoft.com/office/word/2006/wordml" xmlns:wps="http://schemas.microsoft.com/office/word/2010/wordprocessingShape" mc:Ignorable="w14 wp14">
   <w:body>
-    <w:tbl>
-      <w:tblPr>
-        <w:tblW w:type="auto" w:w="0"/>
-        <w:tblLayout w:type="autofit"/>
-        <w:tblLook w:firstColumn="1" w:firstRow="1" w:lastColumn="0" w:lastRow="0" w:noHBand="0" w:noVBand="1" w:val="04A0"/>
-      </w:tblPr>
-      <w:tblGrid>
-        <w:gridCol w:w="4320"/>
-        <w:gridCol w:w="4320"/>
-      </w:tblGrid>
-      <w:tr>
-        <w:tc>
-          <w:tcPr>
-            <w:tcW w:type="dxa" w:w="4320"/>
-          </w:tcPr>
-          <w:p>
-            <w:pPr>
-              <w:jc w:val="center"/>
-            </w:pPr>
-            <w:r>
-              <w:t>{{ co_quan }}</w:t>
-              <w:br/>
-              <w:t>{{ don_vi_soan_thao }}</w:t>
-              <w:br/>
-              <w:t>-------------------</w:t>
-              <w:br/>
-              <w:t>So: {{ so_ky_hieu }}</w:t>
-              <w:br/>
-              <w:t>V/v {{ trich_yeu }}</w:t>
-            </w:r>
-          </w:p>
-        </w:tc>
-        <w:tc>
-          <w:tcPr>
-            <w:tcW w:type="dxa" w:w="4320"/>
-          </w:tcPr>
-          <w:p>
-            <w:pPr>
-              <w:jc w:val="center"/>
-            </w:pPr>
-            <w:r>
-              <w:t>CONG HOA XA HOI CHU NGHIA VIET NAM</w:t>
-              <w:br/>
-              <w:t>Doc lap - Tu do - Hanh phuc</w:t>
-              <w:br/>
-              <w:t>-----------------------</w:t>
-              <w:br/>
-              <w:t>{{ dia_danh }}, ngay {{ ngay }} thang {{ thang }} nam {{ nam }}</w:t>
-            </w:r>
-          </w:p>
-        </w:tc>
-      </w:tr>
-    </w:tbl>
-    <w:p/>
     <w:p>
-      <w:pPr>
-        <w:jc w:val="center"/>
-      </w:pPr>
       <w:r>
-        <w:rPr>
-          <w:b/>
-        </w:rPr>
-        <w:t>Kinh gui: {{ don_vi_nhan }}.</w:t>
+        <w:t>{{ title }}</w:t>
       </w:r>
     </w:p>
     <w:p>
       <w:r>
-        <w:t>{{ doan_mo_dau }}</w:t>
+        <w:t>{{ name }}</w:t>
       </w:r>
     </w:p>
-    <w:p>
-      <w:r>
-        <w:t>{{ doan_noi_dung_1 }}</w:t>
-      </w:r>
-    </w:p>
-    <w:p>
-      <w:r>
-        <w:t>2. Ve viec cu can bo tham gia hoat dong: {{ don_vi_soan_thao }} cu {{ so_luong_cb }} dong chi co ten sau:</w:t>
-      </w:r>
-    </w:p>
+    <w:p/>
     <w:tbl>
       <w:tblPr>
         <w:tblStyle w:val="TableGrid"/>
@@ -101,14 +32,8 @@
             <w:tcW w:type="dxa" w:w="1728"/>
           </w:tcPr>
           <w:p>
-            <w:pPr>
-              <w:jc w:val="center"/>
-            </w:pPr>
             <w:r>
-              <w:rPr>
-                <w:b/>
-              </w:rPr>
-              <w:t>TT</w:t>
+              <w:t>ID</w:t>
             </w:r>
           </w:p>
         </w:tc>
@@ -117,14 +42,8 @@
             <w:tcW w:type="dxa" w:w="1728"/>
           </w:tcPr>
           <w:p>
-            <w:pPr>
-              <w:jc w:val="center"/>
-            </w:pPr>
             <w:r>
-              <w:rPr>
-                <w:b/>
-              </w:rPr>
-              <w:t>Ho va ten</w:t>
+              <w:t>Description</w:t>
             </w:r>
           </w:p>
         </w:tc>
@@ -133,14 +52,8 @@
             <w:tcW w:type="dxa" w:w="1728"/>
           </w:tcPr>
           <w:p>
-            <w:pPr>
-              <w:jc w:val="center"/>
-            </w:pPr>
             <w:r>
-              <w:rPr>
-                <w:b/>
-              </w:rPr>
-              <w:t>Nam sinh</w:t>
+              <w:t>Quantity</w:t>
             </w:r>
           </w:p>
         </w:tc>
@@ -149,14 +62,8 @@
             <w:tcW w:type="dxa" w:w="1728"/>
           </w:tcPr>
           <w:p>
-            <w:pPr>
-              <w:jc w:val="center"/>
-            </w:pPr>
             <w:r>
-              <w:rPr>
-                <w:b/>
-              </w:rPr>
-              <w:t>Chuc vu</w:t>
+              <w:t>Price</w:t>
             </w:r>
           </w:p>
         </w:tc>
@@ -165,14 +72,8 @@
             <w:tcW w:type="dxa" w:w="1728"/>
           </w:tcPr>
           <w:p>
-            <w:pPr>
-              <w:jc w:val="center"/>
-            </w:pPr>
             <w:r>
-              <w:rPr>
-                <w:b/>
-              </w:rPr>
-              <w:t>Ghi chu</w:t>
+              <w:t>Notes</w:t>
             </w:r>
           </w:p>
         </w:tc>
@@ -184,43 +85,7 @@
           </w:tcPr>
           <w:p>
             <w:r>
-              <w:t>{%tr for cb in danh_sach_can_bo %}</w:t>
-            </w:r>
-          </w:p>
-        </w:tc>
-        <w:tc>
-          <w:tcPr>
-            <w:tcW w:type="dxa" w:w="1728"/>
-          </w:tcPr>
-          <w:p/>
-        </w:tc>
-        <w:tc>
-          <w:tcPr>
-            <w:tcW w:type="dxa" w:w="1728"/>
-          </w:tcPr>
-          <w:p/>
-        </w:tc>
-        <w:tc>
-          <w:tcPr>
-            <w:tcW w:type="dxa" w:w="1728"/>
-          </w:tcPr>
-          <w:p/>
-        </w:tc>
-        <w:tc>
-          <w:tcPr>
-            <w:tcW w:type="dxa" w:w="1728"/>
-          </w:tcPr>
-          <w:p/>
-        </w:tc>
-      </w:tr>
-      <w:tr>
-        <w:tc>
-          <w:tcPr>
-            <w:tcW w:type="dxa" w:w="1728"/>
-          </w:tcPr>
-          <w:p>
-            <w:r>
-              <w:t>{{ cb.stt }}</w:t>
+              <w:t>{%tr for item in items %}{{ item.id }}</w:t>
             </w:r>
           </w:p>
         </w:tc>
@@ -230,7 +95,7 @@
           </w:tcPr>
           <w:p>
             <w:r>
-              <w:t>{{ cb.ho_ten }}</w:t>
+              <w:t>{{ item.description }}</w:t>
             </w:r>
           </w:p>
         </w:tc>
@@ -240,7 +105,7 @@
           </w:tcPr>
           <w:p>
             <w:r>
-              <w:t>{{ cb.nam_sinh }}</w:t>
+              <w:t>{{ item.quantity }}</w:t>
             </w:r>
           </w:p>
         </w:tc>
@@ -250,7 +115,7 @@
           </w:tcPr>
           <w:p>
             <w:r>
-              <w:t>{{ cb.chuc_vu }}</w:t>
+              <w:t>{{ item.price }}</w:t>
             </w:r>
           </w:p>
         </w:tc>
@@ -260,94 +125,7 @@
           </w:tcPr>
           <w:p>
             <w:r>
-              <w:t>{{ cb.ghi_chu }}</w:t>
-            </w:r>
-          </w:p>
-        </w:tc>
-      </w:tr>
-      <w:tr>
-        <w:tc>
-          <w:tcPr>
-            <w:tcW w:type="dxa" w:w="1728"/>
-          </w:tcPr>
-          <w:p>
-            <w:r>
-              <w:t>{%tr endfor %}</w:t>
-            </w:r>
-          </w:p>
-        </w:tc>
-        <w:tc>
-          <w:tcPr>
-            <w:tcW w:type="dxa" w:w="1728"/>
-          </w:tcPr>
-          <w:p/>
-        </w:tc>
-        <w:tc>
-          <w:tcPr>
-            <w:tcW w:type="dxa" w:w="1728"/>
-          </w:tcPr>
-          <w:p/>
-        </w:tc>
-        <w:tc>
-          <w:tcPr>
-            <w:tcW w:type="dxa" w:w="1728"/>
-          </w:tcPr>
-          <w:p/>
-        </w:tc>
-        <w:tc>
-          <w:tcPr>
-            <w:tcW w:type="dxa" w:w="1728"/>
-          </w:tcPr>
-          <w:p/>
-        </w:tc>
-      </w:tr>
-    </w:tbl>
-    <w:p>
-      <w:r>
-        <w:t>{{ doan_ket_thuc }}</w:t>
-      </w:r>
-    </w:p>
-    <w:tbl>
-      <w:tblPr>
-        <w:tblW w:type="auto" w:w="0"/>
-        <w:tblLook w:firstColumn="1" w:firstRow="1" w:lastColumn="0" w:lastRow="0" w:noHBand="0" w:noVBand="1" w:val="04A0"/>
-      </w:tblPr>
-      <w:tblGrid>
-        <w:gridCol w:w="4320"/>
-        <w:gridCol w:w="4320"/>
-      </w:tblGrid>
-      <w:tr>
-        <w:tc>
-          <w:tcPr>
-            <w:tcW w:type="dxa" w:w="4320"/>
-          </w:tcPr>
-          <w:p>
-            <w:r>
-              <w:t>Noi nhan:</w:t>
-              <w:br/>
-              <w:t>- Nhu tren {{ ghi_chu_noi_nhan }};</w:t>
-              <w:br/>
-              <w:t>- Luu: {{ noi_luu }}.</w:t>
-            </w:r>
-          </w:p>
-        </w:tc>
-        <w:tc>
-          <w:tcPr>
-            <w:tcW w:type="dxa" w:w="4320"/>
-          </w:tcPr>
-          <w:p>
-            <w:pPr>
-              <w:jc w:val="center"/>
-            </w:pPr>
-            <w:r>
-              <w:rPr>
-                <w:b/>
-              </w:rPr>
-              <w:t>{{ chuc_vu_nguoi_ky }}</w:t>
-              <w:br/>
-              <w:br/>
-              <w:br/>
-              <w:t>{{ nguoi_ky }}</w:t>
+              <w:t>{{ item.notes or '' }}{% endfor %}</w:t>
             </w:r>
           </w:p>
         </w:tc>

</xml_diff>

<commit_message>
fix: resolve compat compatibility, docxtpl table syntax, and separate test templates
</commit_message>
<xml_diff>
--- a/data/template_congvan.docx
+++ b/data/template_congvan.docx
@@ -2,17 +2,86 @@
 <file path=word/document.xml><?xml version="1.0" encoding="utf-8"?>
 <w:document xmlns:wpc="http://schemas.microsoft.com/office/word/2010/wordprocessingCanvas" xmlns:mo="http://schemas.microsoft.com/office/mac/office/2008/main" xmlns:mc="http://schemas.openxmlformats.org/markup-compatibility/2006" xmlns:mv="urn:schemas-microsoft-com:mac:vml" xmlns:o="urn:schemas-microsoft-com:office:office" xmlns:r="http://schemas.openxmlformats.org/officeDocument/2006/relationships" xmlns:m="http://schemas.openxmlformats.org/officeDocument/2006/math" xmlns:v="urn:schemas-microsoft-com:vml" xmlns:wp14="http://schemas.microsoft.com/office/word/2010/wordprocessingDrawing" xmlns:wp="http://schemas.openxmlformats.org/drawingml/2006/wordprocessingDrawing" xmlns:w10="urn:schemas-microsoft-com:office:word" xmlns:w="http://schemas.openxmlformats.org/wordprocessingml/2006/main" xmlns:w14="http://schemas.microsoft.com/office/word/2010/wordml" xmlns:wpg="http://schemas.microsoft.com/office/word/2010/wordprocessingGroup" xmlns:wpi="http://schemas.microsoft.com/office/word/2010/wordprocessingInk" xmlns:wne="http://schemas.microsoft.com/office/word/2006/wordml" xmlns:wps="http://schemas.microsoft.com/office/word/2010/wordprocessingShape" mc:Ignorable="w14 wp14">
   <w:body>
+    <w:tbl>
+      <w:tblPr>
+        <w:tblW w:type="auto" w:w="0"/>
+        <w:tblLayout w:type="autofit"/>
+        <w:tblLook w:firstColumn="1" w:firstRow="1" w:lastColumn="0" w:lastRow="0" w:noHBand="0" w:noVBand="1" w:val="04A0"/>
+      </w:tblPr>
+      <w:tblGrid>
+        <w:gridCol w:w="4320"/>
+        <w:gridCol w:w="4320"/>
+      </w:tblGrid>
+      <w:tr>
+        <w:tc>
+          <w:tcPr>
+            <w:tcW w:type="dxa" w:w="4320"/>
+          </w:tcPr>
+          <w:p>
+            <w:pPr>
+              <w:jc w:val="center"/>
+            </w:pPr>
+            <w:r>
+              <w:t>{{ co_quan }}</w:t>
+              <w:br/>
+              <w:t>{{ don_vi_soan_thao }}</w:t>
+              <w:br/>
+              <w:t>-------------------</w:t>
+              <w:br/>
+              <w:t>So: {{ so_ky_hieu }}</w:t>
+              <w:br/>
+              <w:t>V/v {{ trich_yeu }}</w:t>
+            </w:r>
+          </w:p>
+        </w:tc>
+        <w:tc>
+          <w:tcPr>
+            <w:tcW w:type="dxa" w:w="4320"/>
+          </w:tcPr>
+          <w:p>
+            <w:pPr>
+              <w:jc w:val="center"/>
+            </w:pPr>
+            <w:r>
+              <w:t>CONG HOA XA HOI CHU NGHIA VIET NAM</w:t>
+              <w:br/>
+              <w:t>Doc lap - Tu do - Hanh phuc</w:t>
+              <w:br/>
+              <w:t>-----------------------</w:t>
+              <w:br/>
+              <w:t>{{ dia_danh }}, ngay {{ ngay }} thang {{ thang }} nam {{ nam }}</w:t>
+            </w:r>
+          </w:p>
+        </w:tc>
+      </w:tr>
+    </w:tbl>
+    <w:p/>
     <w:p>
+      <w:pPr>
+        <w:jc w:val="center"/>
+      </w:pPr>
       <w:r>
-        <w:t>{{ title }}</w:t>
+        <w:rPr>
+          <w:b/>
+        </w:rPr>
+        <w:t>Kinh gui: {{ don_vi_nhan }}.</w:t>
       </w:r>
     </w:p>
     <w:p>
       <w:r>
-        <w:t>{{ name }}</w:t>
+        <w:t>{{ doan_mo_dau }}</w:t>
       </w:r>
     </w:p>
-    <w:p/>
+    <w:p>
+      <w:r>
+        <w:t>{{ doan_noi_dung_1 }}</w:t>
+      </w:r>
+    </w:p>
+    <w:p>
+      <w:r>
+        <w:t>2. Ve viec cu can bo tham gia hoat dong: {{ don_vi_soan_thao }} cu {{ so_luong_cb }} dong chi co ten sau:</w:t>
+      </w:r>
+    </w:p>
     <w:tbl>
       <w:tblPr>
         <w:tblStyle w:val="TableGrid"/>
@@ -32,8 +101,14 @@
             <w:tcW w:type="dxa" w:w="1728"/>
           </w:tcPr>
           <w:p>
+            <w:pPr>
+              <w:jc w:val="center"/>
+            </w:pPr>
             <w:r>
-              <w:t>ID</w:t>
+              <w:rPr>
+                <w:b/>
+              </w:rPr>
+              <w:t>TT</w:t>
             </w:r>
           </w:p>
         </w:tc>
@@ -42,8 +117,14 @@
             <w:tcW w:type="dxa" w:w="1728"/>
           </w:tcPr>
           <w:p>
+            <w:pPr>
+              <w:jc w:val="center"/>
+            </w:pPr>
             <w:r>
-              <w:t>Description</w:t>
+              <w:rPr>
+                <w:b/>
+              </w:rPr>
+              <w:t>Ho va ten</w:t>
             </w:r>
           </w:p>
         </w:tc>
@@ -52,8 +133,14 @@
             <w:tcW w:type="dxa" w:w="1728"/>
           </w:tcPr>
           <w:p>
+            <w:pPr>
+              <w:jc w:val="center"/>
+            </w:pPr>
             <w:r>
-              <w:t>Quantity</w:t>
+              <w:rPr>
+                <w:b/>
+              </w:rPr>
+              <w:t>Nam sinh</w:t>
             </w:r>
           </w:p>
         </w:tc>
@@ -62,8 +149,14 @@
             <w:tcW w:type="dxa" w:w="1728"/>
           </w:tcPr>
           <w:p>
+            <w:pPr>
+              <w:jc w:val="center"/>
+            </w:pPr>
             <w:r>
-              <w:t>Price</w:t>
+              <w:rPr>
+                <w:b/>
+              </w:rPr>
+              <w:t>Chuc vu</w:t>
             </w:r>
           </w:p>
         </w:tc>
@@ -72,8 +165,14 @@
             <w:tcW w:type="dxa" w:w="1728"/>
           </w:tcPr>
           <w:p>
+            <w:pPr>
+              <w:jc w:val="center"/>
+            </w:pPr>
             <w:r>
-              <w:t>Notes</w:t>
+              <w:rPr>
+                <w:b/>
+              </w:rPr>
+              <w:t>Ghi chu</w:t>
             </w:r>
           </w:p>
         </w:tc>
@@ -85,7 +184,43 @@
           </w:tcPr>
           <w:p>
             <w:r>
-              <w:t>{%tr for item in items %}{{ item.id }}</w:t>
+              <w:t>{%tr for cb in danh_sach_can_bo %}</w:t>
+            </w:r>
+          </w:p>
+        </w:tc>
+        <w:tc>
+          <w:tcPr>
+            <w:tcW w:type="dxa" w:w="1728"/>
+          </w:tcPr>
+          <w:p/>
+        </w:tc>
+        <w:tc>
+          <w:tcPr>
+            <w:tcW w:type="dxa" w:w="1728"/>
+          </w:tcPr>
+          <w:p/>
+        </w:tc>
+        <w:tc>
+          <w:tcPr>
+            <w:tcW w:type="dxa" w:w="1728"/>
+          </w:tcPr>
+          <w:p/>
+        </w:tc>
+        <w:tc>
+          <w:tcPr>
+            <w:tcW w:type="dxa" w:w="1728"/>
+          </w:tcPr>
+          <w:p/>
+        </w:tc>
+      </w:tr>
+      <w:tr>
+        <w:tc>
+          <w:tcPr>
+            <w:tcW w:type="dxa" w:w="1728"/>
+          </w:tcPr>
+          <w:p>
+            <w:r>
+              <w:t>{{ cb.stt }}</w:t>
             </w:r>
           </w:p>
         </w:tc>
@@ -95,7 +230,7 @@
           </w:tcPr>
           <w:p>
             <w:r>
-              <w:t>{{ item.description }}</w:t>
+              <w:t>{{ cb.ho_ten }}</w:t>
             </w:r>
           </w:p>
         </w:tc>
@@ -105,7 +240,7 @@
           </w:tcPr>
           <w:p>
             <w:r>
-              <w:t>{{ item.quantity }}</w:t>
+              <w:t>{{ cb.nam_sinh }}</w:t>
             </w:r>
           </w:p>
         </w:tc>
@@ -115,7 +250,7 @@
           </w:tcPr>
           <w:p>
             <w:r>
-              <w:t>{{ item.price }}</w:t>
+              <w:t>{{ cb.chuc_vu }}</w:t>
             </w:r>
           </w:p>
         </w:tc>
@@ -125,7 +260,94 @@
           </w:tcPr>
           <w:p>
             <w:r>
-              <w:t>{{ item.notes or '' }}{% endfor %}</w:t>
+              <w:t>{{ cb.ghi_chu }}</w:t>
+            </w:r>
+          </w:p>
+        </w:tc>
+      </w:tr>
+      <w:tr>
+        <w:tc>
+          <w:tcPr>
+            <w:tcW w:type="dxa" w:w="1728"/>
+          </w:tcPr>
+          <w:p>
+            <w:r>
+              <w:t>{%tr endfor %}</w:t>
+            </w:r>
+          </w:p>
+        </w:tc>
+        <w:tc>
+          <w:tcPr>
+            <w:tcW w:type="dxa" w:w="1728"/>
+          </w:tcPr>
+          <w:p/>
+        </w:tc>
+        <w:tc>
+          <w:tcPr>
+            <w:tcW w:type="dxa" w:w="1728"/>
+          </w:tcPr>
+          <w:p/>
+        </w:tc>
+        <w:tc>
+          <w:tcPr>
+            <w:tcW w:type="dxa" w:w="1728"/>
+          </w:tcPr>
+          <w:p/>
+        </w:tc>
+        <w:tc>
+          <w:tcPr>
+            <w:tcW w:type="dxa" w:w="1728"/>
+          </w:tcPr>
+          <w:p/>
+        </w:tc>
+      </w:tr>
+    </w:tbl>
+    <w:p>
+      <w:r>
+        <w:t>{{ doan_ket_thuc }}</w:t>
+      </w:r>
+    </w:p>
+    <w:tbl>
+      <w:tblPr>
+        <w:tblW w:type="auto" w:w="0"/>
+        <w:tblLook w:firstColumn="1" w:firstRow="1" w:lastColumn="0" w:lastRow="0" w:noHBand="0" w:noVBand="1" w:val="04A0"/>
+      </w:tblPr>
+      <w:tblGrid>
+        <w:gridCol w:w="4320"/>
+        <w:gridCol w:w="4320"/>
+      </w:tblGrid>
+      <w:tr>
+        <w:tc>
+          <w:tcPr>
+            <w:tcW w:type="dxa" w:w="4320"/>
+          </w:tcPr>
+          <w:p>
+            <w:r>
+              <w:t>Noi nhan:</w:t>
+              <w:br/>
+              <w:t>- Nhu tren {{ ghi_chu_noi_nhan }};</w:t>
+              <w:br/>
+              <w:t>- Luu: {{ noi_luu }}.</w:t>
+            </w:r>
+          </w:p>
+        </w:tc>
+        <w:tc>
+          <w:tcPr>
+            <w:tcW w:type="dxa" w:w="4320"/>
+          </w:tcPr>
+          <w:p>
+            <w:pPr>
+              <w:jc w:val="center"/>
+            </w:pPr>
+            <w:r>
+              <w:rPr>
+                <w:b/>
+              </w:rPr>
+              <w:t>{{ chuc_vu_nguoi_ky }}</w:t>
+              <w:br/>
+              <w:br/>
+              <w:br/>
+              <w:t>{{ nguoi_ky }}</w:t>
             </w:r>
           </w:p>
         </w:tc>

</xml_diff>

<commit_message>
fix: resolve A4 preview shrinking and update all templates with proper accented Vietnamese
</commit_message>
<xml_diff>
--- a/data/template_congvan.docx
+++ b/data/template_congvan.docx
@@ -28,7 +28,7 @@
               <w:br/>
               <w:t>-------------------</w:t>
               <w:br/>
-              <w:t>So: {{ so_ky_hieu }}</w:t>
+              <w:t>Số: {{ so_ky_hieu }}</w:t>
               <w:br/>
               <w:t>V/v {{ trich_yeu }}</w:t>
             </w:r>
@@ -43,13 +43,13 @@
               <w:jc w:val="center"/>
             </w:pPr>
             <w:r>
-              <w:t>CONG HOA XA HOI CHU NGHIA VIET NAM</w:t>
+              <w:t>CỘNG HÒA XÃ HỘI CHỦ NGHĨA VIỆT NAM</w:t>
               <w:br/>
-              <w:t>Doc lap - Tu do - Hanh phuc</w:t>
+              <w:t>Độc lập - Tự do - Hạnh phúc</w:t>
               <w:br/>
               <w:t>-----------------------</w:t>
               <w:br/>
-              <w:t>{{ dia_danh }}, ngay {{ ngay }} thang {{ thang }} nam {{ nam }}</w:t>
+              <w:t>{{ dia_danh }}, ngày {{ ngay }} tháng {{ thang }} năm {{ nam }}</w:t>
             </w:r>
           </w:p>
         </w:tc>
@@ -64,7 +64,7 @@
         <w:rPr>
           <w:b/>
         </w:rPr>
-        <w:t>Kinh gui: {{ don_vi_nhan }}.</w:t>
+        <w:t>Kính gửi: {{ don_vi_nhan }}.</w:t>
       </w:r>
     </w:p>
     <w:p>
@@ -79,7 +79,7 @@
     </w:p>
     <w:p>
       <w:r>
-        <w:t>2. Ve viec cu can bo tham gia hoat dong: {{ don_vi_soan_thao }} cu {{ so_luong_cb }} dong chi co ten sau:</w:t>
+        <w:t>2. Về việc cử cán bộ tham gia hoạt động: {{ don_vi_soan_thao }} cử {{ so_luong_cb }} đồng chí có tên sau:</w:t>
       </w:r>
     </w:p>
     <w:tbl>
@@ -124,7 +124,7 @@
               <w:rPr>
                 <w:b/>
               </w:rPr>
-              <w:t>Ho va ten</w:t>
+              <w:t>Họ và tên</w:t>
             </w:r>
           </w:p>
         </w:tc>
@@ -140,7 +140,7 @@
               <w:rPr>
                 <w:b/>
               </w:rPr>
-              <w:t>Nam sinh</w:t>
+              <w:t>Năm sinh</w:t>
             </w:r>
           </w:p>
         </w:tc>
@@ -156,7 +156,7 @@
               <w:rPr>
                 <w:b/>
               </w:rPr>
-              <w:t>Chuc vu</w:t>
+              <w:t>Chức vụ</w:t>
             </w:r>
           </w:p>
         </w:tc>
@@ -172,7 +172,7 @@
               <w:rPr>
                 <w:b/>
               </w:rPr>
-              <w:t>Ghi chu</w:t>
+              <w:t>Ghi chú</w:t>
             </w:r>
           </w:p>
         </w:tc>
@@ -323,11 +323,11 @@
           </w:tcPr>
           <w:p>
             <w:r>
-              <w:t>Noi nhan:</w:t>
+              <w:t>Nơi nhận:</w:t>
               <w:br/>
-              <w:t>- Nhu tren {{ ghi_chu_noi_nhan }};</w:t>
+              <w:t>- Như trên {{ ghi_chu_noi_nhan }};</w:t>
               <w:br/>
-              <w:t>- Luu: {{ noi_luu }}.</w:t>
+              <w:t>- Lưu: {{ noi_luu }}.</w:t>
             </w:r>
           </w:p>
         </w:tc>

</xml_diff>

<commit_message>
feat: complete header bold/italic run styling and fix context mapping for loai_van_ban
</commit_message>
<xml_diff>
--- a/data/template_congvan.docx
+++ b/data/template_congvan.docx
@@ -22,12 +22,36 @@
               <w:jc w:val="center"/>
             </w:pPr>
             <w:r>
+              <w:rPr>
+                <w:b/>
+              </w:rPr>
               <w:t>{{ co_quan }}</w:t>
-              <w:br/>
+            </w:r>
+          </w:p>
+          <w:p>
+            <w:pPr>
+              <w:jc w:val="center"/>
+            </w:pPr>
+            <w:r>
+              <w:rPr>
+                <w:b/>
+              </w:rPr>
               <w:t>{{ don_vi_soan_thao }}</w:t>
-              <w:br/>
+            </w:r>
+          </w:p>
+          <w:p>
+            <w:pPr>
+              <w:jc w:val="center"/>
+            </w:pPr>
+            <w:r>
               <w:t>-------------------</w:t>
-              <w:br/>
+            </w:r>
+          </w:p>
+          <w:p>
+            <w:pPr>
+              <w:jc w:val="center"/>
+            </w:pPr>
+            <w:r>
               <w:t>Số: {{ so_ky_hieu }}</w:t>
               <w:br/>
               <w:t>V/v {{ trich_yeu }}</w:t>
@@ -43,12 +67,39 @@
               <w:jc w:val="center"/>
             </w:pPr>
             <w:r>
+              <w:rPr>
+                <w:b/>
+              </w:rPr>
               <w:t>CỘNG HÒA XÃ HỘI CHỦ NGHĨA VIỆT NAM</w:t>
-              <w:br/>
+            </w:r>
+          </w:p>
+          <w:p>
+            <w:pPr>
+              <w:jc w:val="center"/>
+            </w:pPr>
+            <w:r>
+              <w:rPr>
+                <w:b/>
+              </w:rPr>
               <w:t>Độc lập - Tự do - Hạnh phúc</w:t>
-              <w:br/>
+            </w:r>
+          </w:p>
+          <w:p>
+            <w:pPr>
+              <w:jc w:val="center"/>
+            </w:pPr>
+            <w:r>
               <w:t>-----------------------</w:t>
-              <w:br/>
+            </w:r>
+          </w:p>
+          <w:p>
+            <w:pPr>
+              <w:jc w:val="center"/>
+            </w:pPr>
+            <w:r>
+              <w:rPr>
+                <w:i/>
+              </w:rPr>
               <w:t>{{ dia_danh }}, ngày {{ ngay }} tháng {{ thang }} năm {{ nam }}</w:t>
             </w:r>
           </w:p>
@@ -344,9 +395,18 @@
                 <w:b/>
               </w:rPr>
               <w:t>{{ chuc_vu_nguoi_ky }}</w:t>
-              <w:br/>
-              <w:br/>
-              <w:br/>
+            </w:r>
+          </w:p>
+          <w:p/>
+          <w:p/>
+          <w:p>
+            <w:pPr>
+              <w:jc w:val="center"/>
+            </w:pPr>
+            <w:r>
+              <w:rPr>
+                <w:b/>
+              </w:rPr>
               <w:t>{{ nguoi_ky }}</w:t>
             </w:r>
           </w:p>

</xml_diff>

<commit_message>
fix: adjust header column widths to align agency name left and fit motto on a single line
</commit_message>
<xml_diff>
--- a/data/template_congvan.docx
+++ b/data/template_congvan.docx
@@ -5,17 +5,17 @@
     <w:tbl>
       <w:tblPr>
         <w:tblW w:type="auto" w:w="0"/>
-        <w:tblLayout w:type="autofit"/>
+        <w:tblLayout w:type="fixed"/>
         <w:tblLook w:firstColumn="1" w:firstRow="1" w:lastColumn="0" w:lastRow="0" w:noHBand="0" w:noVBand="1" w:val="04A0"/>
       </w:tblPr>
       <w:tblGrid>
-        <w:gridCol w:w="4320"/>
-        <w:gridCol w:w="4320"/>
+        <w:gridCol w:w="3024"/>
+        <w:gridCol w:w="6336"/>
       </w:tblGrid>
       <w:tr>
         <w:tc>
           <w:tcPr>
-            <w:tcW w:type="dxa" w:w="4320"/>
+            <w:tcW w:type="dxa" w:w="3024"/>
           </w:tcPr>
           <w:p>
             <w:pPr>
@@ -60,7 +60,7 @@
         </w:tc>
         <w:tc>
           <w:tcPr>
-            <w:tcW w:type="dxa" w:w="4320"/>
+            <w:tcW w:type="dxa" w:w="6336"/>
           </w:tcPr>
           <w:p>
             <w:pPr>

</xml_diff>